<commit_message>
Recalcula VIF com constante, adiciona analises de temporal/perfil/robustez e alinha titulos sem subtitulo
</commit_message>
<xml_diff>
--- a/[Projeto de pesquisa] - Maycon Henrique Aranha Da Silva.docx
+++ b/[Projeto de pesquisa] - Maycon Henrique Aranha Da Silva.docx
@@ -101,17 +101,7 @@
           <w:sz w:val="22"/>
           <w:szCs w:val="22"/>
         </w:rPr>
-        <w:t>Fatores determinantes da insatisfação do consumidor no e-commerce:</w:t>
-      </w:r>
-      <w:r>
-        <w:rPr>
-          <w:rFonts w:ascii="Arial" w:hAnsi="Arial" w:cs="Arial"/>
-          <w:b/>
-          <w:sz w:val="22"/>
-          <w:szCs w:val="22"/>
-        </w:rPr>
-        <w:br/>
-        <w:t>uma aplicação de regressão para dados de contagem</w:t>
+        <w:t>Fatores determinantes da insatisfação do consumidor no e-commerce</w:t>
       </w:r>
     </w:p>
     <w:p>
@@ -490,7 +480,7 @@
         <w:rPr>
           <w:rFonts w:cs="Arial"/>
         </w:rPr>
-        <w:t>O procedimento de modelagem seguirá Cameron e Trivedi (2013) e Fávero e Belfiore (2024). O primeiro passo é estimar uma regressão de Poisson como modelo baseline, via método iterativo de mínimos quadrados reponderados (IRLS). Na sequência, o teste de Cameron e Trivedi avaliará formalmente a presença de sobredispersão, contrastando a hipótese nula de equidispersão (variância igual à média) contra a alternativa de variância superior à média. Caso a sobredispersão seja confirmada, será ajustado um modelo Binomial Negativa na parametrização NB2, em que o parâmetro de dispersão alfa é estimado pelo método dos momentos, permitindo acomodar a variabilidade extra não capturada pela distribuição de Poisson. Para comparar formalmente os dois modelos, será utilizado o teste de razão de verossimilhança.</w:t>
+        <w:t>O procedimento de modelagem seguirá Cameron e Trivedi (2013) e Fávero e Belfiore (2024). O primeiro passo é estimar uma regressão de Poisson como modelo baseline, via método iterativo de mínimos quadrados reponderados (IRLS). Na sequência, o teste de Cameron e Trivedi avaliará formalmente a presença de sobredispersão, contrastando a hipótese nula de equidispersão (variância igual à média) contra a alternativa de variância superior à média. Caso a sobredispersão seja confirmada, será ajustado um modelo Binomial Negativa na parametrização NB2, em que o parâmetro de dispersão alfa é estimado por máxima verossimilhança, conjuntamente com os coeficientes de regressão, permitindo acomodar a variabilidade extra não capturada pela distribuição de Poisson. Para comparar formalmente os dois modelos, será utilizado o teste de razão de verossimilhança.</w:t>
       </w:r>
     </w:p>
     <w:p>

</xml_diff>